<commit_message>
Revised paper: live corpus results for banquale, qualified RQ4
The live replay of banquale shows scoped prompts all fit the window but the
7.6B model failed to finish 16 of 35 answers on a real project; the paper now
reports that and qualifies the RQ4 answer accordingly.

Co-Authored-By: Claude Opus 5.5 <noreply@anthropic.com>
</commit_message>
<xml_diff>
--- a/paper/paper-revised.docx
+++ b/paper/paper-revised.docx
@@ -115,7 +115,7 @@
           <w:sz w:val="18"/>
           <w:szCs w:val="18"/>
         </w:rPr>
-        <w:t xml:space="preserve">Drift was common: 44 of 52 projects changed conformance after their diagram was abandoned, 20.1% of commits changed it, and the drift was overwhelmingly divergence-led (divergences +1,703, absences +139). A structural gate re-analysed every one of the 514 conformance-changing commits while skipping 60% of commits and 92% of prompt tokens. With the real model, its seeded-deviation calls used 35% of the baseline's measured prompt tokens, and the model evaluated 1.051 times the counterfactual token estimate used in earlier work (range 1.029–1.092), so that estimate holds up. A graph-isomorphism gate skipped more commits but served stale explanations after 51 shape-preserving changes, most of them member replacements rather than the class renames it was designed to tolerate. On a laptop, only 38% of full-project prompts fit a 32k-token window against 87% of structurally scoped ones, so scoping is what makes a local model usable, and scoping also changes what the model notices. We release the tool, the corpus search, the live-model protocol and the scripts behind every number.</w:t>
+        <w:t xml:space="preserve">Drift was common: 44 of 52 projects changed conformance after their diagram was abandoned, 20.1% of commits changed it, and the drift was overwhelmingly divergence-led (divergences +1,703, absences +139). A structural gate re-analysed every one of the 514 conformance-changing commits while skipping 60% of commits and 92% of prompt tokens. With the real model, its seeded-deviation calls used 35% of the baseline's measured prompt tokens, and the model evaluated 1.051 times the counterfactual token estimate used in earlier work (range 1.029–1.092), so that estimate holds up. A graph-isomorphism gate skipped more commits but served stale explanations after 51 shape-preserving changes, most of them member replacements rather than the class renames it was designed to tolerate. On a laptop, only 38% of full-project prompts fit a 32k-token window against 87% of structurally scoped ones, so scoping is what makes a local model usable, although the 7.6B model often failed to finish its answer on a real project; scoping also changes what the model notices. We release the tool, the corpus search, the live-model protocol and the scripts behind every number.</w:t>
       </w:r>
     </w:p>
     <w:p>
@@ -6107,7 +6107,23 @@
           <w:sz w:val="20"/>
           <w:szCs w:val="20"/>
         </w:rPr>
-        <w:t xml:space="preserve"> Where the live arm sent prompts, the saving is measured in tokens the model server evaluated. On the seeded set the structural gate used 35% of the baseline's measured prompt tokens (Table V). The live corpus arm had not finished any project when these numbers were produced.</w:t>
+        <w:t xml:space="preserve"> Where the live arm sent prompts, the saving is measured in tokens the model server evaluated. On the seeded set the structural gate used 35% of the baseline's measured prompt tokens (Table V). In the live corpus arm (1 project: banquale), the structural gate sent 9 real calls (114,868 measured prompt tokens, 48 minutes of model time) and the isomorphism gate 8; every scoped prompt fitted the window, while 4 of the sampled full-project prompts did not and were not sent. On this real project the small model often failed to finish the answer format: 4 of the structural gate's 9 answers, and 16 of all 35 answers, were cut off or were not valid JSON, and the tool fell back to its deterministic findings for those runs. Because </w:t>
+      </w:r>
+      <w:r>
+        <w:rPr>
+          <w:rFonts w:ascii="Courier New" w:cs="Courier New" w:eastAsia="Courier New" w:hAnsi="Courier New"/>
+          <w:sz w:val="18"/>
+          <w:szCs w:val="18"/>
+        </w:rPr>
+        <w:t xml:space="preserve">always</w:t>
+      </w:r>
+      <w:r>
+        <w:rPr>
+          <w:rFonts w:ascii="Times New Roman" w:cs="Times New Roman" w:eastAsia="Times New Roman" w:hAnsi="Times New Roman"/>
+          <w:sz w:val="20"/>
+          <w:szCs w:val="20"/>
+        </w:rPr>
+        <w:t xml:space="preserve"> was sampled, its measured total is not comparable, and Table IV keeps the counterfactual for the corpus-wide saving.</w:t>
       </w:r>
     </w:p>
     <w:p>
@@ -8059,7 +8075,7 @@
                 <w:sz w:val="15"/>
                 <w:szCs w:val="15"/>
               </w:rPr>
-              <w:t xml:space="preserve">43,785</w:t>
+              <w:t xml:space="preserve">43,768</w:t>
             </w:r>
           </w:p>
         </w:tc>
@@ -8091,7 +8107,7 @@
                 <w:sz w:val="15"/>
                 <w:szCs w:val="15"/>
               </w:rPr>
-              <w:t xml:space="preserve">215,765</w:t>
+              <w:t xml:space="preserve">215,682</w:t>
             </w:r>
           </w:p>
         </w:tc>
@@ -8224,7 +8240,7 @@
                 <w:sz w:val="15"/>
                 <w:szCs w:val="15"/>
               </w:rPr>
-              <w:t xml:space="preserve">13,009</w:t>
+              <w:t xml:space="preserve">13,004</w:t>
             </w:r>
           </w:p>
         </w:tc>
@@ -8256,7 +8272,7 @@
                 <w:sz w:val="15"/>
                 <w:szCs w:val="15"/>
               </w:rPr>
-              <w:t xml:space="preserve">61,235</w:t>
+              <w:t xml:space="preserve">61,211</w:t>
             </w:r>
           </w:p>
         </w:tc>
@@ -8389,7 +8405,7 @@
                 <w:sz w:val="15"/>
                 <w:szCs w:val="15"/>
               </w:rPr>
-              <w:t xml:space="preserve">8,970</w:t>
+              <w:t xml:space="preserve">8,967</w:t>
             </w:r>
           </w:p>
         </w:tc>
@@ -8421,7 +8437,7 @@
                 <w:sz w:val="15"/>
                 <w:szCs w:val="15"/>
               </w:rPr>
-              <w:t xml:space="preserve">33,712</w:t>
+              <w:t xml:space="preserve">33,699</w:t>
             </w:r>
           </w:p>
         </w:tc>
@@ -8554,7 +8570,7 @@
                 <w:sz w:val="15"/>
                 <w:szCs w:val="15"/>
               </w:rPr>
-              <w:t xml:space="preserve">10,245</w:t>
+              <w:t xml:space="preserve">10,241</w:t>
             </w:r>
           </w:p>
         </w:tc>
@@ -8586,7 +8602,7 @@
                 <w:sz w:val="15"/>
                 <w:szCs w:val="15"/>
               </w:rPr>
-              <w:t xml:space="preserve">36,873</w:t>
+              <w:t xml:space="preserve">36,859</w:t>
             </w:r>
           </w:p>
         </w:tc>
@@ -8645,7 +8661,7 @@
           <w:sz w:val="20"/>
           <w:szCs w:val="20"/>
         </w:rPr>
-        <w:t xml:space="preserve"> Throughput on the integrated GPU was a median 376 prompt tokens and 12.9 generated tokens per second. On the seeded set a scoped call took a median 39 s against 47 s for a full one, although its prompt was half the size: most of the time is spent writing the answer. A skipped call saves its whole duration, so on local hardware the skip rate, not the prompt size, decides the time a gate saves.  Of the answers, 6 of 45 reached the 2,048-token output cap before closing their JSON; the tool then falls back to the deterministic findings, which is the degradation Section III-A is designed for.</w:t>
+        <w:t xml:space="preserve"> Throughput on the integrated GPU was a median 364 prompt tokens and 12.9 generated tokens per second. On the seeded set a scoped call took a median 39 s against 47 s for a full one, although its prompt was half the size: most of the time is spent writing the answer. A skipped call saves its whole duration, so on local hardware the skip rate, not the prompt size, decides the time a gate saves. In the live corpus arm the structural gate's calls took 5.3 minutes each on average. Of the answers, 8 of 58 reached the 2,048-token output cap before closing their JSON; the tool then falls back to the deterministic findings, which is the degradation Section III-A is designed for.</w:t>
       </w:r>
     </w:p>
     <w:p>
@@ -8670,7 +8686,7 @@
           <w:sz w:val="20"/>
           <w:szCs w:val="20"/>
         </w:rPr>
-        <w:t xml:space="preserve"> Yes, with a structural gate: about nine in ten of its re-analyses fit a laptop model's window, against four in ten full-project checks, and the calls it avoids are where the time goes.</w:t>
+        <w:t xml:space="preserve"> Only with a structural gate, and only partly. About nine in ten of its re-analyses fit a laptop model's window, against four in ten full-project checks, and the calls it avoids are where the time goes. But on a real project a 7.6B model often could not finish the answer format the tool asks for, so the explanation fell back to the deterministic findings for a large share of the calls it did make. The structural gate keeps a local model feasible; it does not make a small one sufficient.</w:t>
       </w:r>
     </w:p>
     <w:p>
@@ -8802,7 +8818,7 @@
           <w:sz w:val="20"/>
           <w:szCs w:val="20"/>
         </w:rPr>
-        <w:t xml:space="preserve"> tokens without sending them. Over the 45 distinct prompts sent here, Ollama evaluated a median of 1.051 times the </w:t>
+        <w:t xml:space="preserve"> tokens without sending them. Over the 58 distinct prompts sent here, Ollama evaluated a median of 1.051 times the </w:t>
       </w:r>
       <w:r>
         <w:rPr>

</xml_diff>

<commit_message>
Final revised paper: clean text, live results for two projects, safe rebuild
Removes revision notes from the manuscript (the three earlier projects are now
described as a pilot) and points Data Availability at the repository. Adds the
bankthread live replay, refreshes the results archive, and makes the PDF export
stop only Word processes it started itself.

Co-Authored-By: Claude Opus 5.5 <noreply@anthropic.com>
</commit_message>
<xml_diff>
--- a/paper/paper-revised.docx
+++ b/paper/paper-revised.docx
@@ -115,7 +115,7 @@
           <w:sz w:val="18"/>
           <w:szCs w:val="18"/>
         </w:rPr>
-        <w:t xml:space="preserve">Drift was common: 44 of 52 projects changed conformance after their diagram was abandoned, 20.1% of commits changed it, and the drift was overwhelmingly divergence-led (divergences +1,703, absences +139). A structural gate re-analysed every one of the 514 conformance-changing commits while skipping 60% of commits and 92% of prompt tokens. With the real model, its seeded-deviation calls used 35% of the baseline's measured prompt tokens, and the model evaluated 1.051 times the counterfactual token estimate used in earlier work (range 1.029–1.092), so that estimate holds up. A graph-isomorphism gate skipped more commits but served stale explanations after 51 shape-preserving changes, most of them member replacements rather than the class renames it was designed to tolerate. On a laptop, only 38% of full-project prompts fit a 32k-token window against 87% of structurally scoped ones, so scoping is what makes a local model usable, although the 7.6B model often failed to finish its answer on a real project; scoping also changes what the model notices. We release the tool, the corpus search, the live-model protocol and the scripts behind every number.</w:t>
+        <w:t xml:space="preserve">Drift was common: 44 of 52 projects changed conformance after their diagram was abandoned, 20.1% of commits changed it, and the drift was overwhelmingly divergence-led (divergences +1,703, absences +139). A structural gate re-analysed every one of the 514 conformance-changing commits while skipping 60% of commits and 92% of prompt tokens. With the real model, its seeded-deviation calls used 35% of the baseline's measured prompt tokens, and the model evaluated 1.051 times the counterfactual token estimate used in earlier work (range 1.021–1.092), so that estimate holds up. A graph-isomorphism gate skipped more commits but served stale explanations after 51 shape-preserving changes, most of them member replacements rather than the class renames it was designed to tolerate. On a laptop, only 38% of full-project prompts fit a 32k-token window against 87% of structurally scoped ones, so scoping is what makes a local model usable, although the 7.6B model often failed to finish its answer on real projects; scoping also changes what the model notices. We release the tool, the corpus search, the live-model protocol and the scripts behind every number.</w:t>
       </w:r>
     </w:p>
     <w:p>
@@ -286,15 +286,15 @@
           <w:sz w:val="20"/>
           <w:szCs w:val="20"/>
         </w:rPr>
-        <w:t xml:space="preserve">What this revision changes.</w:t>
-      </w:r>
-      <w:r>
-        <w:rPr>
-          <w:rFonts w:ascii="Times New Roman" w:cs="Times New Roman" w:eastAsia="Times New Roman" w:hAnsi="Times New Roman"/>
-          <w:sz w:val="20"/>
-          <w:szCs w:val="20"/>
-        </w:rPr>
-        <w:t xml:space="preserve"> An earlier version of this study had two weaknesses. It never ran a language model: its cost evidence was the size of prompts that were never sent. And its corpus held three projects, of which only one drifted. Here we (i) put a real model in the loop, a 7.6-billion-parameter open-weight code model served locally by Ollama, with no hosted API and no key, and record what the model server itself measures; and (ii) replace hand-picked subjects with a systematic search of GitHub for StarUML class models, screened by a rule fixed before any replay, which yields 52 projects.</w:t>
+        <w:t xml:space="preserve">This study.</w:t>
+      </w:r>
+      <w:r>
+        <w:rPr>
+          <w:rFonts w:ascii="Times New Roman" w:cs="Times New Roman" w:eastAsia="Times New Roman" w:hAnsi="Times New Roman"/>
+          <w:sz w:val="20"/>
+          <w:szCs w:val="20"/>
+        </w:rPr>
+        <w:t xml:space="preserve"> A cost argument about language models is only as good as the model behind it, and a drift argument only as good as its corpus. A pilot of this work on three hand-picked projects estimated cost from the size of prompts it never sent, and only one of its projects drifted. Here we (i) put a real model in the loop, a 7.6-billion-parameter open-weight code model served locally by Ollama, with no hosted API and no key, and record what the model server itself measures; and (ii) take the subjects from a systematic search of GitHub for StarUML class models, screened by a rule fixed before any replay, which yields 52 projects.</w:t>
       </w:r>
     </w:p>
     <w:p>
@@ -2103,7 +2103,7 @@
           <w:sz w:val="20"/>
           <w:szCs w:val="20"/>
         </w:rPr>
-        <w:t xml:space="preserve">The previous corpus was three projects found by browsing. This one comes from a search with a fixed procedure (all artifacts in </w:t>
+        <w:t xml:space="preserve">The subjects come from a search with a fixed procedure (all artifacts are in </w:t>
       </w:r>
       <w:r>
         <w:rPr>
@@ -2119,7 +2119,7 @@
           <w:sz w:val="20"/>
           <w:szCs w:val="20"/>
         </w:rPr>
-        <w:t xml:space="preserve">).</w:t>
+        <w:t xml:space="preserve"> of the replication package).</w:t>
       </w:r>
     </w:p>
     <w:p>
@@ -2348,7 +2348,7 @@
           <w:sz w:val="20"/>
           <w:szCs w:val="20"/>
         </w:rPr>
-        <w:t xml:space="preserve">Of the 215 pairs, 112 named too few designed classes in the code, 41 had too little later activity under the analysed directory, 3 had lost the directory, 2 were too large and 5 could not be parsed or checked out; 50 qualified. With the three projects of the first study the corpus has 53. One (city-sim) could not be replayed on Windows because its history contains a path with a trailing space, and 52 were replayed.</w:t>
+        <w:t xml:space="preserve">Of the 215 pairs, 112 named too few designed classes in the code, 41 had too little later activity under the analysed directory, 3 had lost the directory, 2 were too large and 5 could not be parsed or checked out; 50 qualified. With the three projects of the pilot the corpus has 53. One (city-sim) could not be replayed on Windows because its history contains a path with a trailing space, and 52 were replayed.</w:t>
       </w:r>
     </w:p>
     <w:p>
@@ -4570,7 +4570,7 @@
           <w:sz w:val="20"/>
           <w:szCs w:val="20"/>
         </w:rPr>
-        <w:t xml:space="preserve"> The first study's corpus had one drifting project out of three. In this one, 44 of 52 projects changed conformance at least once after their diagrams were abandoned, and about one commit in five (20.1%) changed it. Most of the remaining commits touched source without touching anything a class diagram describes.</w:t>
+        <w:t xml:space="preserve"> In the pilot only one project of three drifted. Here, 44 of 52 projects changed conformance at least once after their diagrams were abandoned, and about one commit in five (20.1%) changed it. Most of the remaining commits touched source without touching anything a class diagram describes.</w:t>
       </w:r>
     </w:p>
     <w:p>
@@ -4595,7 +4595,7 @@
           <w:sz w:val="20"/>
           <w:szCs w:val="20"/>
         </w:rPr>
-        <w:t xml:space="preserve"> 37 windows were divergence-led, and summed over the corpus, divergences grew by 1,703 against 139 for absences. Eroding commits outnumbered repairing ones 412 to 69. The pattern the first study saw in one project generalises: code grows </w:t>
+        <w:t xml:space="preserve"> 37 windows were divergence-led, and summed over the corpus, divergences grew by 1,703 against 139 for absences. Eroding commits outnumbered repairing ones 412 to 69. The pattern the pilot saw in one project generalises: code grows </w:t>
       </w:r>
       <w:r>
         <w:rPr>
@@ -6107,7 +6107,7 @@
           <w:sz w:val="20"/>
           <w:szCs w:val="20"/>
         </w:rPr>
-        <w:t xml:space="preserve"> Where the live arm sent prompts, the saving is measured in tokens the model server evaluated. On the seeded set the structural gate used 35% of the baseline's measured prompt tokens (Table V). In the live corpus arm (1 project: banquale), the structural gate sent 9 real calls (114,868 measured prompt tokens, 48 minutes of model time) and the isomorphism gate 8; every scoped prompt fitted the window, while 4 of the sampled full-project prompts did not and were not sent. On this real project the small model often failed to finish the answer format: 4 of the structural gate's 9 answers, and 16 of all 35 answers, were cut off or were not valid JSON, and the tool fell back to its deterministic findings for those runs. Because </w:t>
+        <w:t xml:space="preserve"> Where the live arm sent prompts, the saving is measured in tokens the model server evaluated. On the seeded set the structural gate used 35% of the baseline's measured prompt tokens (Table V). In the live corpus arm (2 projects: bankthread, banquale), the structural gate sent 14 real calls (136,104 measured prompt tokens, 57 minutes of model time) and the isomorphism gate 13; every scoped prompt fitted the window, while 4 of the sampled full-project prompts did not and were not sent. On these real projects the small model often failed to finish the answer format: 5 of the structural gate's 14 answers, and 20 of all 56 answers, were cut off or were not valid JSON, and the tool fell back to its deterministic findings for those runs. Because </w:t>
       </w:r>
       <w:r>
         <w:rPr>
@@ -8075,7 +8075,7 @@
                 <w:sz w:val="15"/>
                 <w:szCs w:val="15"/>
               </w:rPr>
-              <w:t xml:space="preserve">43,768</w:t>
+              <w:t xml:space="preserve">43,767</w:t>
             </w:r>
           </w:p>
         </w:tc>
@@ -8107,7 +8107,7 @@
                 <w:sz w:val="15"/>
                 <w:szCs w:val="15"/>
               </w:rPr>
-              <w:t xml:space="preserve">215,682</w:t>
+              <w:t xml:space="preserve">215,674</w:t>
             </w:r>
           </w:p>
         </w:tc>
@@ -8272,7 +8272,7 @@
                 <w:sz w:val="15"/>
                 <w:szCs w:val="15"/>
               </w:rPr>
-              <w:t xml:space="preserve">61,211</w:t>
+              <w:t xml:space="preserve">61,209</w:t>
             </w:r>
           </w:p>
         </w:tc>
@@ -8405,7 +8405,7 @@
                 <w:sz w:val="15"/>
                 <w:szCs w:val="15"/>
               </w:rPr>
-              <w:t xml:space="preserve">8,967</w:t>
+              <w:t xml:space="preserve">8,966</w:t>
             </w:r>
           </w:p>
         </w:tc>
@@ -8437,7 +8437,7 @@
                 <w:sz w:val="15"/>
                 <w:szCs w:val="15"/>
               </w:rPr>
-              <w:t xml:space="preserve">33,699</w:t>
+              <w:t xml:space="preserve">33,698</w:t>
             </w:r>
           </w:p>
         </w:tc>
@@ -8570,7 +8570,7 @@
                 <w:sz w:val="15"/>
                 <w:szCs w:val="15"/>
               </w:rPr>
-              <w:t xml:space="preserve">10,241</w:t>
+              <w:t xml:space="preserve">10,240</w:t>
             </w:r>
           </w:p>
         </w:tc>
@@ -8602,7 +8602,7 @@
                 <w:sz w:val="15"/>
                 <w:szCs w:val="15"/>
               </w:rPr>
-              <w:t xml:space="preserve">36,859</w:t>
+              <w:t xml:space="preserve">36,857</w:t>
             </w:r>
           </w:p>
         </w:tc>
@@ -8661,7 +8661,7 @@
           <w:sz w:val="20"/>
           <w:szCs w:val="20"/>
         </w:rPr>
-        <w:t xml:space="preserve"> Throughput on the integrated GPU was a median 364 prompt tokens and 12.9 generated tokens per second. On the seeded set a scoped call took a median 39 s against 47 s for a full one, although its prompt was half the size: most of the time is spent writing the answer. A skipped call saves its whole duration, so on local hardware the skip rate, not the prompt size, decides the time a gate saves. In the live corpus arm the structural gate's calls took 5.3 minutes each on average. Of the answers, 8 of 58 reached the 2,048-token output cap before closing their JSON; the tool then falls back to the deterministic findings, which is the degradation Section III-A is designed for.</w:t>
+        <w:t xml:space="preserve"> Throughput on the integrated GPU was a median 365 prompt tokens and 12.9 generated tokens per second. On the seeded set a scoped call took a median 39 s against 47 s for a full one, although its prompt was half the size: most of the time is spent writing the answer. A skipped call saves its whole duration, so on local hardware the skip rate, not the prompt size, decides the time a gate saves. In the live corpus arm the structural gate's calls took 4.1 minutes each on average. Of the answers, 9 of 59 reached the 2,048-token output cap before closing their JSON; the tool then falls back to the deterministic findings, which is the degradation Section III-A is designed for.</w:t>
       </w:r>
     </w:p>
     <w:p>
@@ -8686,7 +8686,7 @@
           <w:sz w:val="20"/>
           <w:szCs w:val="20"/>
         </w:rPr>
-        <w:t xml:space="preserve"> Only with a structural gate, and only partly. About nine in ten of its re-analyses fit a laptop model's window, against four in ten full-project checks, and the calls it avoids are where the time goes. But on a real project a 7.6B model often could not finish the answer format the tool asks for, so the explanation fell back to the deterministic findings for a large share of the calls it did make. The structural gate keeps a local model feasible; it does not make a small one sufficient.</w:t>
+        <w:t xml:space="preserve"> Only with a structural gate, and only partly. About nine in ten of its re-analyses fit a laptop model's window, against four in ten full-project checks, and the calls it avoids are where the time goes. But on real projects a 7.6B model often could not finish the answer format the tool asks for, so the explanation fell back to the deterministic findings for a large share of the calls it did make. The structural gate keeps a local model feasible; it does not make a small one sufficient.</w:t>
       </w:r>
     </w:p>
     <w:p>
@@ -8802,7 +8802,7 @@
           <w:sz w:val="20"/>
           <w:szCs w:val="20"/>
         </w:rPr>
-        <w:t xml:space="preserve"> The previous version of this study reported prompt sizes in </w:t>
+        <w:t xml:space="preserve"> An offline replay can only report prompt sizes in </w:t>
       </w:r>
       <w:r>
         <w:rPr>
@@ -8818,7 +8818,7 @@
           <w:sz w:val="20"/>
           <w:szCs w:val="20"/>
         </w:rPr>
-        <w:t xml:space="preserve"> tokens without sending them. Over the 58 distinct prompts sent here, Ollama evaluated a median of 1.051 times the </w:t>
+        <w:t xml:space="preserve"> tokens, as the pilot did. Over the 59 distinct prompts sent here, Ollama evaluated a median of 1.051 times the </w:t>
       </w:r>
       <w:r>
         <w:rPr>
@@ -8834,7 +8834,7 @@
           <w:sz w:val="20"/>
           <w:szCs w:val="20"/>
         </w:rPr>
-        <w:t xml:space="preserve"> estimate (range 1.029–1.092). The counterfactual was a slight and nearly uniform underestimate, so every saving reported as a percentage is unaffected.</w:t>
+        <w:t xml:space="preserve"> estimate (range 1.021–1.092). The counterfactual was a slight and nearly uniform underestimate, so every saving reported as a percentage is unaffected.</w:t>
       </w:r>
     </w:p>
     <w:p>
@@ -9778,25 +9778,39 @@
           <w:sz w:val="20"/>
           <w:szCs w:val="20"/>
         </w:rPr>
-        <w:t xml:space="preserve">), the corpus manifest and frozen models, the raw per-run data of the offline and live replays, the model-response cache and the scripts that produce every table and figure are in the replication package (</w:t>
-      </w:r>
-      <w:r>
-        <w:rPr>
-          <w:rFonts w:ascii="Times New Roman" w:cs="Times New Roman" w:eastAsia="Times New Roman" w:hAnsi="Times New Roman"/>
-          <w:sz w:val="20"/>
-          <w:szCs w:val="20"/>
-          <w:highlight w:val="yellow"/>
-          <w:highlightCs w:val="yellow"/>
-        </w:rPr>
-        <w:t xml:space="preserve">&lt;archive link or Zenodo DOI&gt;</w:t>
-      </w:r>
-      <w:r>
-        <w:rPr>
-          <w:rFonts w:ascii="Times New Roman" w:cs="Times New Roman" w:eastAsia="Times New Roman" w:hAnsi="Times New Roman"/>
-          <w:sz w:val="20"/>
-          <w:szCs w:val="20"/>
-        </w:rPr>
-        <w:t xml:space="preserve">).</w:t>
+        <w:t xml:space="preserve">), the corpus manifest and frozen models, the raw per-run data of the offline and live replays, the model-response cache and the scripts that produce every table and figure are in the replication package: </w:t>
+      </w:r>
+      <w:r>
+        <w:rPr>
+          <w:rFonts w:ascii="Courier New" w:cs="Courier New" w:eastAsia="Courier New" w:hAnsi="Courier New"/>
+          <w:sz w:val="18"/>
+          <w:szCs w:val="18"/>
+        </w:rPr>
+        <w:t xml:space="preserve">replication/</w:t>
+      </w:r>
+      <w:r>
+        <w:rPr>
+          <w:rFonts w:ascii="Times New Roman" w:cs="Times New Roman" w:eastAsia="Times New Roman" w:hAnsi="Times New Roman"/>
+          <w:sz w:val="20"/>
+          <w:szCs w:val="20"/>
+        </w:rPr>
+        <w:t xml:space="preserve"> and </w:t>
+      </w:r>
+      <w:r>
+        <w:rPr>
+          <w:rFonts w:ascii="Courier New" w:cs="Courier New" w:eastAsia="Courier New" w:hAnsi="Courier New"/>
+          <w:sz w:val="18"/>
+          <w:szCs w:val="18"/>
+        </w:rPr>
+        <w:t xml:space="preserve">research/</w:t>
+      </w:r>
+      <w:r>
+        <w:rPr>
+          <w:rFonts w:ascii="Times New Roman" w:cs="Times New Roman" w:eastAsia="Times New Roman" w:hAnsi="Times New Roman"/>
+          <w:sz w:val="20"/>
+          <w:szCs w:val="20"/>
+        </w:rPr>
+        <w:t xml:space="preserve"> in https://github.com/Sarvesh-S-25/uml-analyzer.</w:t>
       </w:r>
     </w:p>
     <w:p>

</xml_diff>